<commit_message>
Formato de los informes en el texto propio de los notebooks
- cuaderno.formato_entrega: en las celdas agregadas por nosotros (no en las del
  notebook base) quita las cursivas fuera de fórmulas, código, URL y
  referencias, y quita la numeración de los encabezados
- Práctica 6: etiquetas de hallazgos sin número y con el mismo formato
- Notebooks de las 8 prácticas actualizados; PDF, Word y zip regenerados sin
  volver a ejecutarlos

Co-Authored-By: Claude Opus 5.5 <noreply@anthropic.com>
</commit_message>
<xml_diff>
--- a/actividades/06-practica-3-filtros-espaciales/Practica3_Filtros_espaciales.docx
+++ b/actividades/06-practica-3-filtros-espaciales/Practica3_Filtros_espaciales.docx
@@ -114,23 +114,7 @@
         <w:t xml:space="preserve"> </w:t>
       </w:r>
       <w:r>
-        <w:t xml:space="preserve">Implementar los filtros espaciales</w:t>
-      </w:r>
-      <w:r>
-        <w:t xml:space="preserve"> </w:t>
-      </w:r>
-      <w:r>
-        <w:rPr>
-          <w:iCs/>
-          <w:i/>
-        </w:rPr>
-        <w:t xml:space="preserve">desde cero</w:t>
-      </w:r>
-      <w:r>
-        <w:t xml:space="preserve"> </w:t>
-      </w:r>
-      <w:r>
-        <w:t xml:space="preserve">(sin funciones de OpenCV) para entender qué hace la convolución con un kernel,</w:t>
+        <w:t xml:space="preserve">Implementar los filtros espaciales desde cero (sin funciones de OpenCV) para entender qué hace la convolución con un kernel,</w:t>
       </w:r>
       <w:r>
         <w:t xml:space="preserve"> </w:t>
@@ -1070,13 +1054,13 @@
         <w:pStyle w:val="FirstParagraph"/>
       </w:pPr>
     </w:p>
-    <w:bookmarkStart w:id="21" w:name="Xf8bc31b2f64221beacf30cc458d498a04f5665c"/>
+    <w:bookmarkStart w:id="21" w:name="X7fac892200bb902e1635d67a4821b38c048e97c"/>
     <w:p>
       <w:pPr>
         <w:pStyle w:val="Heading2"/>
       </w:pPr>
       <w:r>
-        <w:t xml:space="preserve">1. Convolución y filtros básicos con kernels preestablecidos</w:t>
+        <w:t xml:space="preserve">Convolución y filtros básicos con kernels preestablecidos</w:t>
       </w:r>
     </w:p>
     <w:p>
@@ -6360,23 +6344,7 @@
         <w:t xml:space="preserve"> </w:t>
       </w:r>
       <w:r>
-        <w:t xml:space="preserve">(6 términos en lugar de 9 por kernel). El Laplaciano de 4 vecinos no es separable como producto de dos vectores (es la</w:t>
-      </w:r>
-      <w:r>
-        <w:t xml:space="preserve"> </w:t>
-      </w:r>
-      <w:r>
-        <w:rPr>
-          <w:iCs/>
-          <w:i/>
-        </w:rPr>
-        <w:t xml:space="preserve">suma</w:t>
-      </w:r>
-      <w:r>
-        <w:t xml:space="preserve"> </w:t>
-      </w:r>
-      <w:r>
-        <w:t xml:space="preserve">de dos kernels separables).</w:t>
+        <w:t xml:space="preserve">(6 términos en lugar de 9 por kernel). El Laplaciano de 4 vecinos no es separable como producto de dos vectores (es la suma de dos kernels separables).</w:t>
       </w:r>
       <w:r>
         <w:t xml:space="preserve"> </w:t>
@@ -8099,20 +8067,7 @@
         <w:pStyle w:val="FirstParagraph"/>
       </w:pPr>
       <w:r>
-        <w:t xml:space="preserve">Los operadores anteriores son detectores de</w:t>
-      </w:r>
-      <w:r>
-        <w:t xml:space="preserve"> </w:t>
-      </w:r>
-      <w:r>
-        <w:rPr>
-          <w:iCs/>
-          <w:i/>
-        </w:rPr>
-        <w:t xml:space="preserve">borde</w:t>
-      </w:r>
-      <w:r>
-        <w:t xml:space="preserve">. Para líneas delgadas (marcas de carril, por ejemplo) se usan máscaras que responden a un trazo brillante de un píxel de ancho en una orientación concreta (Gonzalez &amp; Woods, 2018, cap. 10):</w:t>
+        <w:t xml:space="preserve">Los operadores anteriores son detectores de borde. Para líneas delgadas (marcas de carril, por ejemplo) se usan máscaras que responden a un trazo brillante de un píxel de ancho en una orientación concreta (Gonzalez &amp; Woods, 2018, cap. 10):</w:t>
       </w:r>
     </w:p>
     <w:bookmarkEnd w:id="27"/>
@@ -9284,23 +9239,7 @@
         <w:t xml:space="preserve"> </w:t>
       </w:r>
       <w:r>
-        <w:t xml:space="preserve">es el realce estándar de Gonzalez y Woods (2018), y valores mayores dan un realce más agresivo con riesgo de</w:t>
-      </w:r>
-      <w:r>
-        <w:t xml:space="preserve"> </w:t>
-      </w:r>
-      <w:r>
-        <w:rPr>
-          <w:iCs/>
-          <w:i/>
-        </w:rPr>
-        <w:t xml:space="preserve">halos</w:t>
-      </w:r>
-      <w:r>
-        <w:t xml:space="preserve"> </w:t>
-      </w:r>
-      <w:r>
-        <w:t xml:space="preserve">y de amplificar el ruido.</w:t>
+        <w:t xml:space="preserve">es el realce estándar de Gonzalez y Woods (2018), y valores mayores dan un realce más agresivo con riesgo de halos y de amplificar el ruido.</w:t>
       </w:r>
     </w:p>
     <w:p>

</xml_diff>